<commit_message>
Khoa học 4, Đạo đức 4–5, LS&ĐL 4–5, Toán 4, Tiếng Việt 5: cột 7 bỏ dòng Năng lực số kiểu cũ không có trong giáo án (đồng bộ app bản 171)
Co-Authored-By: Claude Fable 5.1 <noreply@anthropic.com>
</commit_message>
<xml_diff>
--- a/assets/docs/lop5/Lich su va Dia li - Lop 5.docx
+++ b/assets/docs/lop5/Lich su va Dia li - Lop 5.docx
@@ -3395,7 +3395,6 @@
                 <w:i w:val="0"/>
                 <w:sz w:val="18"/>
               </w:rPr>
-              <w:t>NLS-KT (Cơ bản 2): Cho HS xem hiện vật, di tích liên quan “Triều lý và việc định đô ở thăng long” qua bảo tàng số.</w:t>
             </w:r>
           </w:p>
         </w:tc>
@@ -3768,7 +3767,6 @@
                 <w:i w:val="0"/>
                 <w:sz w:val="18"/>
               </w:rPr>
-              <w:t>NLS-ST (Cơ bản 2): HS dùng công cụ trên máy dựng trục thời gian, sắp các sự kiện của bài theo đúng thứ tự.</w:t>
             </w:r>
           </w:p>
         </w:tc>
@@ -4374,7 +4372,6 @@
                 <w:i w:val="0"/>
                 <w:sz w:val="18"/>
               </w:rPr>
-              <w:t>NLS-KT (Cơ bản 2): Cho HS xem hiện vật, di tích liên quan “Khởi nghĩa lam sơn và triều hậu lê” qua bảo tàng số.</w:t>
             </w:r>
           </w:p>
         </w:tc>
@@ -4747,7 +4744,6 @@
                 <w:i w:val="0"/>
                 <w:sz w:val="18"/>
               </w:rPr>
-              <w:t>NLS-ST (Cơ bản 2): HS dùng công cụ trên máy dựng trục thời gian, sắp các sự kiện của bài theo đúng thứ tự.</w:t>
             </w:r>
           </w:p>
         </w:tc>
@@ -7378,7 +7374,6 @@
                 <w:i w:val="0"/>
                 <w:sz w:val="18"/>
               </w:rPr>
-              <w:t>NLS-KT (Cơ bản 2): Dùng quả địa cầu số hoặc bản đồ thế giới tương tác.</w:t>
             </w:r>
           </w:p>
         </w:tc>

</xml_diff>